<commit_message>
refactor: scalenie MaterialRequirementsPanel, usunięcie zduplikowanych komponentów, v2026.04.21.118
Co-Authored-By: Claude Sonnet 4.6 <noreply@anthropic.com>
</commit_message>
<xml_diff>
--- a/ERP- planowanie perojektu.docx
+++ b/ERP- planowanie perojektu.docx
@@ -1085,27 +1085,56 @@
     <w:p>
       <w:pPr>
         <w:spacing w:after="0"/>
-      </w:pPr>
-      <w:r>
-        <w:t xml:space="preserve">        └── materials2 — Materiały</w:t>
-      </w:r>
-    </w:p>
-    <w:p>
-      <w:pPr>
-        <w:spacing w:after="0"/>
-      </w:pPr>
-      <w:r>
+        <w:rPr>
+          <w:lang w:val="en-US"/>
+        </w:rPr>
+      </w:pPr>
+      <w:r>
+        <w:t xml:space="preserve">        </w:t>
+      </w:r>
+      <w:r>
+        <w:rPr>
+          <w:lang w:val="en-US"/>
+        </w:rPr>
+        <w:t xml:space="preserve">└── materials2 — </w:t>
+      </w:r>
+      <w:proofErr w:type="spellStart"/>
+      <w:r>
+        <w:rPr>
+          <w:lang w:val="en-US"/>
+        </w:rPr>
+        <w:t>Materiały</w:t>
+      </w:r>
+      <w:proofErr w:type="spellEnd"/>
+    </w:p>
+    <w:p>
+      <w:pPr>
+        <w:spacing w:after="0"/>
+        <w:rPr>
+          <w:lang w:val="en-US"/>
+        </w:rPr>
+      </w:pPr>
+      <w:r>
+        <w:rPr>
+          <w:lang w:val="en-US"/>
+        </w:rPr>
         <w:t xml:space="preserve">            └── &lt;MaterialRequirementsPanel3&gt;</w:t>
       </w:r>
     </w:p>
     <w:p>
       <w:pPr>
         <w:spacing w:after="0"/>
-      </w:pPr>
-    </w:p>
-    <w:p>
-      <w:pPr>
-        <w:spacing w:after="0"/>
+        <w:rPr>
+          <w:lang w:val="en-US"/>
+        </w:rPr>
+      </w:pPr>
+    </w:p>
+    <w:p>
+      <w:pPr>
+        <w:spacing w:after="0"/>
+        <w:rPr>
+          <w:lang w:val="en-US"/>
+        </w:rPr>
       </w:pPr>
     </w:p>
     <w:p>
@@ -1340,49 +1369,203 @@
     <w:p>
       <w:pPr>
         <w:spacing w:after="0"/>
+        <w:rPr>
+          <w:lang w:val="en-US"/>
+        </w:rPr>
       </w:pPr>
       <w:r>
         <w:rPr>
           <w:b/>
           <w:bCs/>
-        </w:rPr>
-        <w:t>"PDF wszystkie sekcje"</w:t>
-      </w:r>
-      <w:r>
-        <w:t> — projectPdfExport.js</w:t>
-      </w:r>
-    </w:p>
-    <w:p>
-      <w:pPr>
-        <w:spacing w:after="0"/>
-      </w:pPr>
+          <w:lang w:val="en-US"/>
+        </w:rPr>
+        <w:t xml:space="preserve">"PDF </w:t>
+      </w:r>
+      <w:proofErr w:type="spellStart"/>
       <w:r>
         <w:rPr>
           <w:b/>
           <w:bCs/>
-        </w:rPr>
-        <w:t>"PDF tej zakładki"</w:t>
-      </w:r>
-      <w:r>
-        <w:t> — nowy przycisk w </w:t>
-      </w:r>
-      <w:proofErr w:type="spellStart"/>
-      <w:r>
+          <w:lang w:val="en-US"/>
+        </w:rPr>
+        <w:t>wszystkie</w:t>
+      </w:r>
+      <w:proofErr w:type="spellEnd"/>
+      <w:r>
+        <w:rPr>
+          <w:b/>
+          <w:bCs/>
+          <w:lang w:val="en-US"/>
+        </w:rPr>
+        <w:t xml:space="preserve"> </w:t>
+      </w:r>
+      <w:proofErr w:type="spellStart"/>
+      <w:r>
+        <w:rPr>
+          <w:b/>
+          <w:bCs/>
+          <w:lang w:val="en-US"/>
+        </w:rPr>
+        <w:t>sekcje</w:t>
+      </w:r>
+      <w:proofErr w:type="spellEnd"/>
+      <w:r>
+        <w:rPr>
+          <w:b/>
+          <w:bCs/>
+          <w:lang w:val="en-US"/>
+        </w:rPr>
+        <w:t>"</w:t>
+      </w:r>
+      <w:r>
+        <w:rPr>
+          <w:lang w:val="en-US"/>
+        </w:rPr>
+        <w:t> — projectPdfExport.js</w:t>
+      </w:r>
+    </w:p>
+    <w:p>
+      <w:pPr>
+        <w:spacing w:after="0"/>
+        <w:rPr>
+          <w:lang w:val="en-US"/>
+        </w:rPr>
+      </w:pPr>
+      <w:r>
+        <w:rPr>
+          <w:b/>
+          <w:bCs/>
+          <w:lang w:val="en-US"/>
+        </w:rPr>
+        <w:t xml:space="preserve">"PDF </w:t>
+      </w:r>
+      <w:proofErr w:type="spellStart"/>
+      <w:r>
+        <w:rPr>
+          <w:b/>
+          <w:bCs/>
+          <w:lang w:val="en-US"/>
+        </w:rPr>
+        <w:t>tej</w:t>
+      </w:r>
+      <w:proofErr w:type="spellEnd"/>
+      <w:r>
+        <w:rPr>
+          <w:b/>
+          <w:bCs/>
+          <w:lang w:val="en-US"/>
+        </w:rPr>
+        <w:t xml:space="preserve"> </w:t>
+      </w:r>
+      <w:proofErr w:type="spellStart"/>
+      <w:r>
+        <w:rPr>
+          <w:b/>
+          <w:bCs/>
+          <w:lang w:val="en-US"/>
+        </w:rPr>
+        <w:t>zakładki</w:t>
+      </w:r>
+      <w:proofErr w:type="spellEnd"/>
+      <w:r>
+        <w:rPr>
+          <w:b/>
+          <w:bCs/>
+          <w:lang w:val="en-US"/>
+        </w:rPr>
+        <w:t>"</w:t>
+      </w:r>
+      <w:r>
+        <w:rPr>
+          <w:lang w:val="en-US"/>
+        </w:rPr>
+        <w:t xml:space="preserve"> — </w:t>
+      </w:r>
+      <w:proofErr w:type="spellStart"/>
+      <w:r>
+        <w:rPr>
+          <w:lang w:val="en-US"/>
+        </w:rPr>
+        <w:t>nowy</w:t>
+      </w:r>
+      <w:proofErr w:type="spellEnd"/>
+      <w:r>
+        <w:rPr>
+          <w:lang w:val="en-US"/>
+        </w:rPr>
+        <w:t xml:space="preserve"> </w:t>
+      </w:r>
+      <w:proofErr w:type="spellStart"/>
+      <w:r>
+        <w:rPr>
+          <w:lang w:val="en-US"/>
+        </w:rPr>
+        <w:t>przycisk</w:t>
+      </w:r>
+      <w:proofErr w:type="spellEnd"/>
+      <w:r>
+        <w:rPr>
+          <w:lang w:val="en-US"/>
+        </w:rPr>
+        <w:t xml:space="preserve"> w </w:t>
+      </w:r>
+      <w:proofErr w:type="spellStart"/>
+      <w:r>
+        <w:rPr>
+          <w:lang w:val="en-US"/>
+        </w:rPr>
         <w:t>RequirementsTab</w:t>
       </w:r>
       <w:proofErr w:type="spellEnd"/>
       <w:r>
-        <w:t> + nowy plik requirementsPdfExport.js</w:t>
-      </w:r>
-    </w:p>
-    <w:p>
-      <w:pPr>
-        <w:spacing w:after="0"/>
-      </w:pPr>
-    </w:p>
-    <w:p>
-      <w:pPr>
-        <w:spacing w:after="0"/>
+        <w:rPr>
+          <w:lang w:val="en-US"/>
+        </w:rPr>
+        <w:t xml:space="preserve"> + </w:t>
+      </w:r>
+      <w:proofErr w:type="spellStart"/>
+      <w:r>
+        <w:rPr>
+          <w:lang w:val="en-US"/>
+        </w:rPr>
+        <w:t>nowy</w:t>
+      </w:r>
+      <w:proofErr w:type="spellEnd"/>
+      <w:r>
+        <w:rPr>
+          <w:lang w:val="en-US"/>
+        </w:rPr>
+        <w:t xml:space="preserve"> </w:t>
+      </w:r>
+      <w:proofErr w:type="spellStart"/>
+      <w:r>
+        <w:rPr>
+          <w:lang w:val="en-US"/>
+        </w:rPr>
+        <w:t>plik</w:t>
+      </w:r>
+      <w:proofErr w:type="spellEnd"/>
+      <w:r>
+        <w:rPr>
+          <w:lang w:val="en-US"/>
+        </w:rPr>
+        <w:t> requirementsPdfExport.js</w:t>
+      </w:r>
+    </w:p>
+    <w:p>
+      <w:pPr>
+        <w:spacing w:after="0"/>
+        <w:rPr>
+          <w:lang w:val="en-US"/>
+        </w:rPr>
+      </w:pPr>
+    </w:p>
+    <w:p>
+      <w:pPr>
+        <w:spacing w:after="0"/>
+        <w:rPr>
+          <w:lang w:val="en-US"/>
+        </w:rPr>
       </w:pPr>
     </w:p>
     <w:p>
@@ -1621,6 +1804,154 @@
           <w:lang w:val="en-US"/>
         </w:rPr>
       </w:pPr>
+    </w:p>
+    <w:p>
+      <w:pPr>
+        <w:spacing w:after="0"/>
+        <w:rPr>
+          <w:lang w:val="en-US"/>
+        </w:rPr>
+      </w:pPr>
+      <w:r>
+        <w:rPr>
+          <w:lang w:val="en-US"/>
+        </w:rPr>
+        <w:t>DEPLOY</w:t>
+      </w:r>
+    </w:p>
+    <w:p>
+      <w:pPr>
+        <w:spacing w:after="0"/>
+        <w:rPr>
+          <w:lang w:val="en-US"/>
+        </w:rPr>
+      </w:pPr>
+      <w:r>
+        <w:rPr>
+          <w:lang w:val="en-US"/>
+        </w:rPr>
+        <w:t xml:space="preserve">ssh </w:t>
+      </w:r>
+      <w:proofErr w:type="spellStart"/>
+      <w:r>
+        <w:rPr>
+          <w:lang w:val="en-US"/>
+        </w:rPr>
+        <w:t>gigatel</w:t>
+      </w:r>
+      <w:proofErr w:type="spellEnd"/>
+      <w:r>
+        <w:rPr>
+          <w:lang w:val="en-US"/>
+        </w:rPr>
+        <w:t xml:space="preserve"> "cd /</w:t>
+      </w:r>
+      <w:proofErr w:type="spellStart"/>
+      <w:r>
+        <w:rPr>
+          <w:lang w:val="en-US"/>
+        </w:rPr>
+        <w:t>srv</w:t>
+      </w:r>
+      <w:proofErr w:type="spellEnd"/>
+      <w:r>
+        <w:rPr>
+          <w:lang w:val="en-US"/>
+        </w:rPr>
+        <w:t>/apps/</w:t>
+      </w:r>
+      <w:proofErr w:type="spellStart"/>
+      <w:r>
+        <w:rPr>
+          <w:lang w:val="en-US"/>
+        </w:rPr>
+        <w:t>erp</w:t>
+      </w:r>
+      <w:proofErr w:type="spellEnd"/>
+      <w:r>
+        <w:rPr>
+          <w:lang w:val="en-US"/>
+        </w:rPr>
+        <w:t xml:space="preserve"> &amp;&amp; git pull &amp;&amp; cd apps &amp;&amp; docker compose up -d --build frontend backend"</w:t>
+      </w:r>
+    </w:p>
+    <w:p>
+      <w:pPr>
+        <w:spacing w:after="0"/>
+        <w:rPr>
+          <w:lang w:val="en-US"/>
+        </w:rPr>
+      </w:pPr>
+    </w:p>
+    <w:p>
+      <w:pPr>
+        <w:spacing w:after="0"/>
+        <w:rPr>
+          <w:lang w:val="en-US"/>
+        </w:rPr>
+      </w:pPr>
+      <w:r>
+        <w:rPr>
+          <w:lang w:val="en-US"/>
+        </w:rPr>
+        <w:t>deploy MOBAXTERM</w:t>
+      </w:r>
+    </w:p>
+    <w:p>
+      <w:pPr>
+        <w:spacing w:after="0"/>
+        <w:rPr>
+          <w:lang w:val="en-US"/>
+        </w:rPr>
+      </w:pPr>
+      <w:r>
+        <w:rPr>
+          <w:lang w:val="en-US"/>
+        </w:rPr>
+        <w:t>ssh -</w:t>
+      </w:r>
+      <w:proofErr w:type="spellStart"/>
+      <w:r>
+        <w:rPr>
+          <w:lang w:val="en-US"/>
+        </w:rPr>
+        <w:t>i</w:t>
+      </w:r>
+      <w:proofErr w:type="spellEnd"/>
+      <w:r>
+        <w:rPr>
+          <w:lang w:val="en-US"/>
+        </w:rPr>
+        <w:t xml:space="preserve"> /drives/c/Users/Andrzej/.ssh/id_ed25519 deploy@159.69.212.91 "cd /</w:t>
+      </w:r>
+      <w:proofErr w:type="spellStart"/>
+      <w:r>
+        <w:rPr>
+          <w:lang w:val="en-US"/>
+        </w:rPr>
+        <w:t>srv</w:t>
+      </w:r>
+      <w:proofErr w:type="spellEnd"/>
+      <w:r>
+        <w:rPr>
+          <w:lang w:val="en-US"/>
+        </w:rPr>
+        <w:t>/apps/</w:t>
+      </w:r>
+      <w:proofErr w:type="spellStart"/>
+      <w:r>
+        <w:rPr>
+          <w:lang w:val="en-US"/>
+        </w:rPr>
+        <w:t>erp</w:t>
+      </w:r>
+      <w:proofErr w:type="spellEnd"/>
+      <w:r>
+        <w:rPr>
+          <w:lang w:val="en-US"/>
+        </w:rPr>
+        <w:t xml:space="preserve"> &amp;&amp; git pull &amp;&amp; cd apps &amp;&amp; docker compose up -d --build frontend backend"</w:t>
+      </w:r>
     </w:p>
     <w:sectPr>
       <w:pgSz w:w="16838" w:h="11906" w:orient="landscape"/>
@@ -2472,6 +2803,7 @@
   <w:style w:type="character" w:default="1" w:styleId="Domylnaczcionkaakapitu">
     <w:name w:val="Default Paragraph Font"/>
     <w:uiPriority w:val="1"/>
+    <w:semiHidden/>
     <w:unhideWhenUsed/>
   </w:style>
   <w:style w:type="table" w:default="1" w:styleId="Standardowy">

</xml_diff>

<commit_message>
fix(wbs): version snapshot freeze + Q&A nie znika
- versioning.service: dedup OrderRequirements (unique nodeId+versionId) i
  loadSourceRows zwraca tylko wiersze wersji jeśli istnieją (pełny freeze,
  bez merge z baseline → usunięcie z jednej wersji nie wpływa na inne).
- wbs-nodes.service: getUnifiedTree analogicznie freeze; parseQa nie filtruje
  pustych par {q:'',a:''} — round-trip zachowuje świeżo dodane wiersze.
- WBSHybridTable: QaCell.add() nie triggeruje save (pusta para byłaby
  odfiltrowana na backendzie i znikała z UI).
- LoginPage v2026.04.28.260
</commit_message>
<xml_diff>
--- a/ERP- planowanie perojektu.docx
+++ b/ERP- planowanie perojektu.docx
@@ -831,654 +831,1161 @@
         <w:spacing w:after="0"/>
       </w:pPr>
       <w:r>
-        <w:t xml:space="preserve">        </w:t>
-      </w:r>
-      <w:r>
-        <w:rPr>
-          <w:rFonts w:ascii="MS Gothic" w:eastAsia="MS Gothic" w:hAnsi="MS Gothic" w:cs="MS Gothic" w:hint="eastAsia"/>
-        </w:rPr>
-        <w:t>├</w:t>
-      </w:r>
-      <w:r>
-        <w:rPr>
-          <w:rFonts w:ascii="Aptos" w:hAnsi="Aptos" w:cs="Aptos"/>
-        </w:rPr>
-        <w:t>──</w:t>
-      </w:r>
-      <w:r>
-        <w:t xml:space="preserve"> </w:t>
-      </w:r>
-      <w:proofErr w:type="spellStart"/>
-      <w:r>
-        <w:t>strategy</w:t>
-      </w:r>
-      <w:proofErr w:type="spellEnd"/>
-      <w:r>
-        <w:t xml:space="preserve"> </w:t>
-      </w:r>
-      <w:r>
-        <w:rPr>
-          <w:rFonts w:ascii="Aptos" w:hAnsi="Aptos" w:cs="Aptos"/>
-        </w:rPr>
-        <w:t>—</w:t>
-      </w:r>
-      <w:r>
-        <w:t xml:space="preserve"> Jak to chcemy zrobi</w:t>
-      </w:r>
-      <w:r>
-        <w:rPr>
-          <w:rFonts w:ascii="Aptos" w:hAnsi="Aptos" w:cs="Aptos"/>
-        </w:rPr>
-        <w:t>ć</w:t>
-      </w:r>
-    </w:p>
-    <w:p>
-      <w:pPr>
-        <w:spacing w:after="0"/>
-      </w:pPr>
-      <w:r>
-        <w:t xml:space="preserve">        │   └── edytor strategii (</w:t>
-      </w:r>
-      <w:proofErr w:type="spellStart"/>
-      <w:r>
-        <w:t>textarea</w:t>
-      </w:r>
-      <w:proofErr w:type="spellEnd"/>
-      <w:r>
-        <w:t>)</w:t>
-      </w:r>
-    </w:p>
-    <w:p>
-      <w:pPr>
-        <w:spacing w:after="0"/>
-      </w:pPr>
-      <w:r>
-        <w:t xml:space="preserve">        </w:t>
-      </w:r>
-      <w:r>
-        <w:rPr>
-          <w:rFonts w:ascii="MS Gothic" w:eastAsia="MS Gothic" w:hAnsi="MS Gothic" w:cs="MS Gothic" w:hint="eastAsia"/>
-        </w:rPr>
-        <w:t>├</w:t>
-      </w:r>
-      <w:r>
-        <w:rPr>
-          <w:rFonts w:ascii="Aptos" w:hAnsi="Aptos" w:cs="Aptos"/>
-        </w:rPr>
-        <w:t>──</w:t>
-      </w:r>
-      <w:r>
-        <w:t xml:space="preserve"> </w:t>
-      </w:r>
-      <w:proofErr w:type="spellStart"/>
-      <w:r>
-        <w:t>wbs</w:t>
-      </w:r>
-      <w:proofErr w:type="spellEnd"/>
-      <w:r>
-        <w:t xml:space="preserve"> </w:t>
-      </w:r>
-      <w:r>
-        <w:rPr>
-          <w:rFonts w:ascii="Aptos" w:hAnsi="Aptos" w:cs="Aptos"/>
-        </w:rPr>
-        <w:t>—</w:t>
-      </w:r>
-      <w:r>
-        <w:t xml:space="preserve"> Struktura zada</w:t>
-      </w:r>
-      <w:r>
-        <w:rPr>
-          <w:rFonts w:ascii="Aptos" w:hAnsi="Aptos" w:cs="Aptos"/>
-        </w:rPr>
-        <w:t>ń</w:t>
-      </w:r>
-      <w:r>
-        <w:t xml:space="preserve"> projektu: {</w:t>
-      </w:r>
-      <w:proofErr w:type="spellStart"/>
-      <w:r>
-        <w:t>projectName</w:t>
-      </w:r>
-      <w:proofErr w:type="spellEnd"/>
-      <w:r>
-        <w:t>}</w:t>
-      </w:r>
-    </w:p>
-    <w:p>
-      <w:pPr>
-        <w:spacing w:after="0"/>
-      </w:pPr>
-      <w:r>
-        <w:t xml:space="preserve">        │   └── AG </w:t>
-      </w:r>
-      <w:proofErr w:type="spellStart"/>
-      <w:r>
-        <w:t>Grid</w:t>
-      </w:r>
-      <w:proofErr w:type="spellEnd"/>
-      <w:r>
-        <w:t xml:space="preserve"> – drzewo WBS (nazwa, typ, status, osoba, znaczniki)</w:t>
-      </w:r>
-    </w:p>
-    <w:p>
-      <w:pPr>
-        <w:spacing w:after="0"/>
-        <w:rPr>
-          <w:lang w:val="en-US"/>
-        </w:rPr>
-      </w:pPr>
-      <w:r>
-        <w:t xml:space="preserve">        </w:t>
-      </w:r>
-      <w:r>
-        <w:rPr>
-          <w:rFonts w:ascii="MS Gothic" w:eastAsia="MS Gothic" w:hAnsi="MS Gothic" w:cs="MS Gothic" w:hint="eastAsia"/>
-          <w:lang w:val="en-US"/>
-        </w:rPr>
-        <w:t>├</w:t>
-      </w:r>
-      <w:r>
-        <w:rPr>
-          <w:rFonts w:ascii="Aptos" w:hAnsi="Aptos" w:cs="Aptos"/>
-          <w:lang w:val="en-US"/>
-        </w:rPr>
-        <w:t>──</w:t>
-      </w:r>
-      <w:r>
-        <w:rPr>
-          <w:lang w:val="en-US"/>
-        </w:rPr>
-        <w:t xml:space="preserve"> budget </w:t>
-      </w:r>
-      <w:r>
-        <w:rPr>
-          <w:rFonts w:ascii="Aptos" w:hAnsi="Aptos" w:cs="Aptos"/>
-          <w:lang w:val="en-US"/>
-        </w:rPr>
-        <w:t>—</w:t>
-      </w:r>
-      <w:r>
-        <w:rPr>
-          <w:lang w:val="en-US"/>
-        </w:rPr>
-        <w:t xml:space="preserve"> Plan </w:t>
-      </w:r>
-      <w:proofErr w:type="spellStart"/>
-      <w:r>
-        <w:rPr>
-          <w:lang w:val="en-US"/>
-        </w:rPr>
-        <w:t>i</w:t>
-      </w:r>
-      <w:proofErr w:type="spellEnd"/>
-      <w:r>
-        <w:rPr>
-          <w:lang w:val="en-US"/>
-        </w:rPr>
-        <w:t xml:space="preserve"> </w:t>
-      </w:r>
-      <w:proofErr w:type="spellStart"/>
-      <w:r>
-        <w:rPr>
-          <w:lang w:val="en-US"/>
-        </w:rPr>
-        <w:t>harmonogram</w:t>
-      </w:r>
-      <w:proofErr w:type="spellEnd"/>
-      <w:r>
-        <w:rPr>
-          <w:lang w:val="en-US"/>
-        </w:rPr>
-        <w:t xml:space="preserve"> (</w:t>
-      </w:r>
-      <w:proofErr w:type="spellStart"/>
-      <w:r>
-        <w:rPr>
-          <w:lang w:val="en-US"/>
-        </w:rPr>
-        <w:t>Bud</w:t>
-      </w:r>
-      <w:r>
-        <w:rPr>
-          <w:rFonts w:ascii="Aptos" w:hAnsi="Aptos" w:cs="Aptos"/>
-          <w:lang w:val="en-US"/>
-        </w:rPr>
-        <w:t>ż</w:t>
-      </w:r>
-      <w:r>
-        <w:rPr>
-          <w:lang w:val="en-US"/>
-        </w:rPr>
-        <w:t>et</w:t>
-      </w:r>
-      <w:proofErr w:type="spellEnd"/>
-      <w:r>
-        <w:rPr>
-          <w:lang w:val="en-US"/>
-        </w:rPr>
-        <w:t>) (manager/admin)</w:t>
-      </w:r>
-    </w:p>
-    <w:p>
-      <w:pPr>
-        <w:spacing w:after="0"/>
-      </w:pPr>
-      <w:r>
-        <w:rPr>
-          <w:lang w:val="en-US"/>
-        </w:rPr>
-        <w:t xml:space="preserve">        </w:t>
-      </w:r>
-      <w:r>
-        <w:t xml:space="preserve">│   └── AG </w:t>
-      </w:r>
-      <w:proofErr w:type="spellStart"/>
-      <w:r>
-        <w:t>Grid</w:t>
-      </w:r>
-      <w:proofErr w:type="spellEnd"/>
-      <w:r>
-        <w:t xml:space="preserve"> – tabela budżetowa (koszt, ilość, marża, rabat, cena)</w:t>
-      </w:r>
-    </w:p>
-    <w:p>
-      <w:pPr>
-        <w:spacing w:after="0"/>
-        <w:rPr>
-          <w:lang w:val="en-US"/>
-        </w:rPr>
-      </w:pPr>
-      <w:r>
-        <w:t xml:space="preserve">        </w:t>
-      </w:r>
-      <w:r>
-        <w:rPr>
-          <w:lang w:val="en-US"/>
-        </w:rPr>
-        <w:t xml:space="preserve">└── materials2 — </w:t>
-      </w:r>
-      <w:proofErr w:type="spellStart"/>
-      <w:r>
-        <w:rPr>
-          <w:lang w:val="en-US"/>
-        </w:rPr>
-        <w:t>Materiały</w:t>
-      </w:r>
-      <w:proofErr w:type="spellEnd"/>
-    </w:p>
-    <w:p>
-      <w:pPr>
-        <w:spacing w:after="0"/>
-        <w:rPr>
-          <w:lang w:val="en-US"/>
-        </w:rPr>
-      </w:pPr>
-      <w:r>
-        <w:rPr>
-          <w:lang w:val="en-US"/>
-        </w:rPr>
-        <w:t xml:space="preserve">            └── &lt;MaterialRequirementsPanel3&gt;</w:t>
-      </w:r>
-    </w:p>
-    <w:p>
-      <w:pPr>
-        <w:spacing w:after="0"/>
-        <w:rPr>
-          <w:lang w:val="en-US"/>
-        </w:rPr>
-      </w:pPr>
-    </w:p>
-    <w:p>
-      <w:pPr>
-        <w:spacing w:after="0"/>
-        <w:rPr>
-          <w:lang w:val="en-US"/>
-        </w:rPr>
-      </w:pPr>
-    </w:p>
-    <w:p>
-      <w:pPr>
-        <w:spacing w:after="0"/>
-        <w:rPr>
-          <w:lang w:val="en-US"/>
-        </w:rPr>
-      </w:pPr>
-      <w:r>
-        <w:rPr>
-          <w:lang w:val="en-US"/>
-        </w:rPr>
-        <w:t>Root (</w:t>
-      </w:r>
-      <w:proofErr w:type="spellStart"/>
-      <w:r>
-        <w:rPr>
-          <w:lang w:val="en-US"/>
-        </w:rPr>
-        <w:t>nodeName</w:t>
-      </w:r>
-      <w:proofErr w:type="spellEnd"/>
-      <w:r>
-        <w:rPr>
-          <w:lang w:val="en-US"/>
-        </w:rPr>
-        <w:t xml:space="preserve">)                    — depth -1, slate, </w:t>
-      </w:r>
-      <w:proofErr w:type="spellStart"/>
-      <w:r>
-        <w:rPr>
-          <w:lang w:val="en-US"/>
-        </w:rPr>
-        <w:t>brak</w:t>
-      </w:r>
-      <w:proofErr w:type="spellEnd"/>
-      <w:r>
-        <w:rPr>
-          <w:lang w:val="en-US"/>
-        </w:rPr>
-        <w:t xml:space="preserve"> </w:t>
-      </w:r>
-      <w:proofErr w:type="spellStart"/>
-      <w:r>
-        <w:rPr>
-          <w:lang w:val="en-US"/>
-        </w:rPr>
-        <w:t>typu</w:t>
-      </w:r>
-      <w:proofErr w:type="spellEnd"/>
-    </w:p>
-    <w:p>
-      <w:pPr>
-        <w:spacing w:after="0"/>
-      </w:pPr>
-      <w:r>
-        <w:rPr>
-          <w:lang w:val="en-US"/>
-        </w:rPr>
-        <w:t xml:space="preserve">  </w:t>
-      </w:r>
-      <w:r>
-        <w:t xml:space="preserve">└─ Przedmiot projektu            — </w:t>
-      </w:r>
-      <w:proofErr w:type="spellStart"/>
-      <w:r>
-        <w:t>depth</w:t>
-      </w:r>
-      <w:proofErr w:type="spellEnd"/>
-      <w:r>
-        <w:t xml:space="preserve"> 0, niebieski, </w:t>
-      </w:r>
-      <w:proofErr w:type="spellStart"/>
-      <w:r>
-        <w:t>bold</w:t>
-      </w:r>
-      <w:proofErr w:type="spellEnd"/>
-      <w:r>
-        <w:t xml:space="preserve"> </w:t>
-      </w:r>
-      <w:proofErr w:type="spellStart"/>
-      <w:r>
-        <w:t>uppercase</w:t>
-      </w:r>
-      <w:proofErr w:type="spellEnd"/>
-      <w:r>
-        <w:t xml:space="preserve">, BEZ </w:t>
-      </w:r>
-      <w:proofErr w:type="spellStart"/>
-      <w:r>
-        <w:t>selecta</w:t>
-      </w:r>
-      <w:proofErr w:type="spellEnd"/>
-      <w:r>
-        <w:t xml:space="preserve"> typu</w:t>
-      </w:r>
-    </w:p>
-    <w:p>
-      <w:pPr>
-        <w:spacing w:after="0"/>
-      </w:pPr>
-      <w:r>
-        <w:t xml:space="preserve">       └─ Element podrzędny        — </w:t>
-      </w:r>
-      <w:proofErr w:type="spellStart"/>
-      <w:r>
-        <w:t>depth</w:t>
-      </w:r>
-      <w:proofErr w:type="spellEnd"/>
-      <w:r>
-        <w:t xml:space="preserve"> 1, fioletowy, </w:t>
-      </w:r>
-      <w:proofErr w:type="spellStart"/>
-      <w:r>
-        <w:t>select</w:t>
-      </w:r>
-      <w:proofErr w:type="spellEnd"/>
-      <w:r>
-        <w:t>: Urządzenie/Materiał/Praca/Usługi</w:t>
-      </w:r>
-    </w:p>
-    <w:p>
-      <w:pPr>
-        <w:spacing w:after="0"/>
-        <w:rPr>
-          <w:lang w:val="en-US"/>
-        </w:rPr>
-      </w:pPr>
-      <w:r>
-        <w:t xml:space="preserve">            </w:t>
-      </w:r>
-      <w:r>
-        <w:rPr>
-          <w:lang w:val="en-US"/>
-        </w:rPr>
-        <w:t xml:space="preserve">└─ Pod-element          — depth 2, teal, select </w:t>
-      </w:r>
-      <w:proofErr w:type="spellStart"/>
-      <w:r>
-        <w:rPr>
-          <w:lang w:val="en-US"/>
-        </w:rPr>
-        <w:t>typu</w:t>
-      </w:r>
-      <w:proofErr w:type="spellEnd"/>
-    </w:p>
-    <w:p>
-      <w:pPr>
-        <w:spacing w:after="0"/>
-        <w:rPr>
-          <w:lang w:val="en-US"/>
-        </w:rPr>
-      </w:pPr>
-      <w:r>
-        <w:rPr>
-          <w:lang w:val="en-US"/>
-        </w:rPr>
-        <w:t xml:space="preserve">                 └─ </w:t>
-      </w:r>
-      <w:proofErr w:type="spellStart"/>
-      <w:r>
-        <w:rPr>
-          <w:lang w:val="en-US"/>
-        </w:rPr>
-        <w:t>Najgłębszy</w:t>
-      </w:r>
-      <w:proofErr w:type="spellEnd"/>
-      <w:r>
-        <w:rPr>
-          <w:lang w:val="en-US"/>
-        </w:rPr>
-        <w:t xml:space="preserve">      — depth 3 (MAX), amber, select </w:t>
-      </w:r>
-      <w:proofErr w:type="spellStart"/>
-      <w:r>
-        <w:rPr>
-          <w:lang w:val="en-US"/>
-        </w:rPr>
-        <w:t>typu</w:t>
-      </w:r>
-      <w:proofErr w:type="spellEnd"/>
-    </w:p>
-    <w:p>
-      <w:pPr>
-        <w:spacing w:after="0"/>
-        <w:rPr>
-          <w:lang w:val="en-US"/>
-        </w:rPr>
-      </w:pPr>
-    </w:p>
-    <w:p>
-      <w:pPr>
-        <w:spacing w:after="0"/>
-        <w:rPr>
-          <w:lang w:val="en-US"/>
-        </w:rPr>
-      </w:pPr>
-    </w:p>
-    <w:p>
-      <w:pPr>
-        <w:spacing w:after="0"/>
-        <w:rPr>
-          <w:lang w:val="en-US"/>
-        </w:rPr>
-      </w:pPr>
-    </w:p>
-    <w:p>
-      <w:pPr>
-        <w:spacing w:after="0"/>
-        <w:rPr>
-          <w:lang w:val="en-US"/>
-        </w:rPr>
-      </w:pPr>
-    </w:p>
-    <w:p>
-      <w:pPr>
-        <w:spacing w:after="0"/>
-        <w:rPr>
-          <w:lang w:val="en-US"/>
-        </w:rPr>
-      </w:pPr>
-    </w:p>
-    <w:p>
-      <w:pPr>
-        <w:spacing w:after="0"/>
-        <w:rPr>
-          <w:lang w:val="en-US"/>
-        </w:rPr>
-      </w:pPr>
-    </w:p>
-    <w:p>
-      <w:pPr>
-        <w:spacing w:after="0"/>
-        <w:rPr>
-          <w:lang w:val="en-US"/>
-        </w:rPr>
+        <w:t>Oto nazwy sekcji/elementów widocznych w widoku WBS (od góry do dołu):</w:t>
+      </w:r>
+    </w:p>
+    <w:p>
+      <w:pPr>
+        <w:spacing w:after="0"/>
+      </w:pPr>
+      <w:r>
+        <w:pict w14:anchorId="6CBA46B4">
+          <v:rect id="_x0000_i1031" style="width:0;height:0" o:hralign="center" o:hrstd="t" o:hr="t" fillcolor="#a0a0a0" stroked="f"/>
+        </w:pict>
+      </w:r>
+    </w:p>
+    <w:p>
+      <w:pPr>
+        <w:spacing w:after="0"/>
       </w:pPr>
       <w:r>
         <w:rPr>
           <w:b/>
           <w:bCs/>
-          <w:lang w:val="en-US"/>
-        </w:rPr>
-        <w:t xml:space="preserve">"PDF </w:t>
-      </w:r>
-      <w:proofErr w:type="spellStart"/>
+        </w:rPr>
+        <w:t>1. </w:t>
+      </w:r>
+      <w:proofErr w:type="spellStart"/>
+      <w:r>
+        <w:t>section-header</w:t>
+      </w:r>
+      <w:proofErr w:type="spellEnd"/>
+      <w:r>
+        <w:t xml:space="preserve"> — </w:t>
+      </w:r>
+      <w:proofErr w:type="spellStart"/>
+      <w:r>
+        <w:t>sticky</w:t>
+      </w:r>
+      <w:proofErr w:type="spellEnd"/>
+      <w:r>
+        <w:t xml:space="preserve"> pasek na górze</w:t>
+      </w:r>
+      <w:r>
+        <w:br/>
+        <w:t xml:space="preserve">"STRUKTURA PROJEKTU: STADION" + przyciski PDF + </w:t>
+      </w:r>
+      <w:proofErr w:type="spellStart"/>
+      <w:r>
+        <w:t>chevron</w:t>
+      </w:r>
+      <w:proofErr w:type="spellEnd"/>
+      <w:r>
+        <w:br/>
+      </w:r>
+      <w:r>
+        <w:rPr>
+          <w:i/>
+          <w:iCs/>
+        </w:rPr>
+        <w:t>(klasa: </w:t>
+      </w:r>
+      <w:proofErr w:type="spellStart"/>
+      <w:r>
+        <w:rPr>
+          <w:i/>
+          <w:iCs/>
+        </w:rPr>
+        <w:t>sticky</w:t>
+      </w:r>
+      <w:proofErr w:type="spellEnd"/>
+      <w:r>
+        <w:rPr>
+          <w:i/>
+          <w:iCs/>
+        </w:rPr>
+        <w:t xml:space="preserve"> top-0 z-20 </w:t>
+      </w:r>
+      <w:proofErr w:type="spellStart"/>
+      <w:r>
+        <w:rPr>
+          <w:i/>
+          <w:iCs/>
+        </w:rPr>
+        <w:t>bg</w:t>
+      </w:r>
+      <w:proofErr w:type="spellEnd"/>
+      <w:r>
+        <w:rPr>
+          <w:i/>
+          <w:iCs/>
+        </w:rPr>
+        <w:t>-[#0b0f17] w </w:t>
+      </w:r>
+      <w:proofErr w:type="spellStart"/>
+      <w:r>
+        <w:rPr>
+          <w:i/>
+          <w:iCs/>
+        </w:rPr>
+        <w:t>renderSection</w:t>
+      </w:r>
+      <w:proofErr w:type="spellEnd"/>
+      <w:r>
+        <w:rPr>
+          <w:i/>
+          <w:iCs/>
+        </w:rPr>
+        <w:t>)</w:t>
+      </w:r>
+    </w:p>
+    <w:p>
+      <w:pPr>
+        <w:spacing w:after="0"/>
+      </w:pPr>
       <w:r>
         <w:rPr>
           <w:b/>
           <w:bCs/>
-          <w:lang w:val="en-US"/>
-        </w:rPr>
-        <w:t>wszystkie</w:t>
-      </w:r>
-      <w:proofErr w:type="spellEnd"/>
+        </w:rPr>
+        <w:t>2. </w:t>
+      </w:r>
+      <w:proofErr w:type="spellStart"/>
+      <w:r>
+        <w:t>table-scroll-area</w:t>
+      </w:r>
+      <w:proofErr w:type="spellEnd"/>
+      <w:r>
+        <w:t xml:space="preserve"> — </w:t>
+      </w:r>
+      <w:proofErr w:type="spellStart"/>
+      <w:r>
+        <w:t>przewijalna</w:t>
+      </w:r>
+      <w:proofErr w:type="spellEnd"/>
+      <w:r>
+        <w:t xml:space="preserve"> strefa tabeli</w:t>
+      </w:r>
+      <w:r>
+        <w:br/>
+        <w:t xml:space="preserve">Zawiera wiersze WBS, </w:t>
+      </w:r>
+      <w:proofErr w:type="spellStart"/>
+      <w:r>
+        <w:t>scrolluje</w:t>
+      </w:r>
+      <w:proofErr w:type="spellEnd"/>
+      <w:r>
+        <w:t xml:space="preserve"> pionowo i poziomo</w:t>
+      </w:r>
+      <w:r>
+        <w:br/>
+      </w:r>
+      <w:r>
+        <w:rPr>
+          <w:i/>
+          <w:iCs/>
+        </w:rPr>
+        <w:t xml:space="preserve">(klasa: flex-1 min-h-0 </w:t>
+      </w:r>
+      <w:proofErr w:type="spellStart"/>
+      <w:r>
+        <w:rPr>
+          <w:i/>
+          <w:iCs/>
+        </w:rPr>
+        <w:t>overflow</w:t>
+      </w:r>
+      <w:proofErr w:type="spellEnd"/>
+      <w:r>
+        <w:rPr>
+          <w:i/>
+          <w:iCs/>
+        </w:rPr>
+        <w:t xml:space="preserve">-auto </w:t>
+      </w:r>
+      <w:proofErr w:type="spellStart"/>
+      <w:r>
+        <w:rPr>
+          <w:i/>
+          <w:iCs/>
+        </w:rPr>
+        <w:t>custom-scrollbar</w:t>
+      </w:r>
+      <w:proofErr w:type="spellEnd"/>
+      <w:r>
+        <w:rPr>
+          <w:i/>
+          <w:iCs/>
+        </w:rPr>
+        <w:t> w </w:t>
+      </w:r>
+      <w:proofErr w:type="spellStart"/>
+      <w:r>
+        <w:rPr>
+          <w:i/>
+          <w:iCs/>
+        </w:rPr>
+        <w:t>WBSHybridTable</w:t>
+      </w:r>
+      <w:proofErr w:type="spellEnd"/>
+      <w:r>
+        <w:rPr>
+          <w:i/>
+          <w:iCs/>
+        </w:rPr>
+        <w:t>)</w:t>
+      </w:r>
+    </w:p>
+    <w:p>
+      <w:pPr>
+        <w:spacing w:after="0"/>
+      </w:pPr>
       <w:r>
         <w:rPr>
           <w:b/>
           <w:bCs/>
-          <w:lang w:val="en-US"/>
-        </w:rPr>
-        <w:t xml:space="preserve"> </w:t>
-      </w:r>
-      <w:proofErr w:type="spellStart"/>
+        </w:rPr>
+        <w:t>3. </w:t>
+      </w:r>
+      <w:proofErr w:type="spellStart"/>
+      <w:r>
+        <w:t>table-head</w:t>
+      </w:r>
+      <w:proofErr w:type="spellEnd"/>
+      <w:r>
+        <w:t> — nagłówki kolumn tabeli</w:t>
+      </w:r>
+      <w:r>
+        <w:br/>
+        <w:t>NAZWA / TYP / ILOŚĆ WYMAGAŃ / JEDNOSTKA / STATUS / WŁAŚCICIEL / ZASOBY / KOMENTARZ / ZNACZNIKI / ZAŁĄCZNIKI</w:t>
+      </w:r>
+      <w:r>
+        <w:br/>
+      </w:r>
+      <w:r>
+        <w:rPr>
+          <w:i/>
+          <w:iCs/>
+        </w:rPr>
+        <w:t>(klasa: </w:t>
+      </w:r>
+      <w:proofErr w:type="spellStart"/>
+      <w:r>
+        <w:rPr>
+          <w:i/>
+          <w:iCs/>
+        </w:rPr>
+        <w:t>sticky</w:t>
+      </w:r>
+      <w:proofErr w:type="spellEnd"/>
+      <w:r>
+        <w:rPr>
+          <w:i/>
+          <w:iCs/>
+        </w:rPr>
+        <w:t xml:space="preserve"> top-0 z-10 </w:t>
+      </w:r>
+      <w:proofErr w:type="spellStart"/>
+      <w:r>
+        <w:rPr>
+          <w:i/>
+          <w:iCs/>
+        </w:rPr>
+        <w:t>bg</w:t>
+      </w:r>
+      <w:proofErr w:type="spellEnd"/>
+      <w:r>
+        <w:rPr>
+          <w:i/>
+          <w:iCs/>
+        </w:rPr>
+        <w:t>-[#0b0f17])</w:t>
+      </w:r>
+    </w:p>
+    <w:p>
+      <w:pPr>
+        <w:spacing w:after="0"/>
+      </w:pPr>
       <w:r>
         <w:rPr>
           <w:b/>
           <w:bCs/>
-          <w:lang w:val="en-US"/>
-        </w:rPr>
-        <w:t>sekcje</w:t>
-      </w:r>
-      <w:proofErr w:type="spellEnd"/>
+        </w:rPr>
+        <w:t>4. </w:t>
+      </w:r>
+      <w:proofErr w:type="spellStart"/>
+      <w:r>
+        <w:t>table</w:t>
+      </w:r>
+      <w:proofErr w:type="spellEnd"/>
+      <w:r>
+        <w:t>-body — wiersze danych</w:t>
+      </w:r>
+      <w:r>
+        <w:br/>
+        <w:t xml:space="preserve">Poszczególne pozycje WBS z </w:t>
+      </w:r>
+      <w:proofErr w:type="spellStart"/>
+      <w:r>
+        <w:t>dropdownami</w:t>
+      </w:r>
+      <w:proofErr w:type="spellEnd"/>
+      <w:r>
+        <w:t xml:space="preserve">, </w:t>
+      </w:r>
+      <w:proofErr w:type="spellStart"/>
+      <w:r>
+        <w:t>inputami</w:t>
+      </w:r>
+      <w:proofErr w:type="spellEnd"/>
+      <w:r>
+        <w:t xml:space="preserve">, </w:t>
+      </w:r>
+      <w:proofErr w:type="spellStart"/>
+      <w:r>
+        <w:t>tagami</w:t>
+      </w:r>
+      <w:proofErr w:type="spellEnd"/>
+      <w:r>
+        <w:br/>
+      </w:r>
+      <w:r>
+        <w:rPr>
+          <w:i/>
+          <w:iCs/>
+        </w:rPr>
+        <w:t>(</w:t>
+      </w:r>
+      <w:proofErr w:type="spellStart"/>
+      <w:r>
+        <w:rPr>
+          <w:i/>
+          <w:iCs/>
+        </w:rPr>
+        <w:t>tbody</w:t>
+      </w:r>
+      <w:proofErr w:type="spellEnd"/>
+      <w:r>
+        <w:rPr>
+          <w:i/>
+          <w:iCs/>
+        </w:rPr>
+        <w:t>)</w:t>
+      </w:r>
+    </w:p>
+    <w:p>
+      <w:pPr>
+        <w:spacing w:after="0"/>
+      </w:pPr>
       <w:r>
         <w:rPr>
           <w:b/>
           <w:bCs/>
-          <w:lang w:val="en-US"/>
-        </w:rPr>
-        <w:t>"</w:t>
-      </w:r>
-      <w:r>
-        <w:rPr>
-          <w:lang w:val="en-US"/>
-        </w:rPr>
-        <w:t> — projectPdfExport.js</w:t>
-      </w:r>
-    </w:p>
-    <w:p>
-      <w:pPr>
-        <w:spacing w:after="0"/>
-        <w:rPr>
-          <w:lang w:val="en-US"/>
-        </w:rPr>
+        </w:rPr>
+        <w:t>5. </w:t>
+      </w:r>
+      <w:r>
+        <w:t>basket-bar — pasek koszyka przyklejony do dołu</w:t>
+      </w:r>
+      <w:r>
+        <w:br/>
+        <w:t xml:space="preserve">"KOSZYK — NIEPRZYPISANE (13)" z </w:t>
+      </w:r>
+      <w:proofErr w:type="spellStart"/>
+      <w:r>
+        <w:t>chevronem</w:t>
+      </w:r>
+      <w:proofErr w:type="spellEnd"/>
+      <w:r>
+        <w:t xml:space="preserve"> — rozwijany</w:t>
+      </w:r>
+      <w:r>
+        <w:br/>
+      </w:r>
+      <w:r>
+        <w:rPr>
+          <w:i/>
+          <w:iCs/>
+        </w:rPr>
+        <w:t xml:space="preserve">(klasa: flex-shrink-0 </w:t>
+      </w:r>
+      <w:proofErr w:type="spellStart"/>
+      <w:r>
+        <w:rPr>
+          <w:i/>
+          <w:iCs/>
+        </w:rPr>
+        <w:t>border</w:t>
+      </w:r>
+      <w:proofErr w:type="spellEnd"/>
+      <w:r>
+        <w:rPr>
+          <w:i/>
+          <w:iCs/>
+        </w:rPr>
+        <w:t xml:space="preserve">-t </w:t>
+      </w:r>
+      <w:proofErr w:type="spellStart"/>
+      <w:r>
+        <w:rPr>
+          <w:i/>
+          <w:iCs/>
+        </w:rPr>
+        <w:t>border-white</w:t>
+      </w:r>
+      <w:proofErr w:type="spellEnd"/>
+      <w:r>
+        <w:rPr>
+          <w:i/>
+          <w:iCs/>
+        </w:rPr>
+        <w:t xml:space="preserve">/5 </w:t>
+      </w:r>
+      <w:proofErr w:type="spellStart"/>
+      <w:r>
+        <w:rPr>
+          <w:i/>
+          <w:iCs/>
+        </w:rPr>
+        <w:t>bg</w:t>
+      </w:r>
+      <w:proofErr w:type="spellEnd"/>
+      <w:r>
+        <w:rPr>
+          <w:i/>
+          <w:iCs/>
+        </w:rPr>
+        <w:t>-[#0b0f17])</w:t>
+      </w:r>
+    </w:p>
+    <w:p>
+      <w:pPr>
+        <w:spacing w:after="0"/>
       </w:pPr>
       <w:r>
         <w:rPr>
           <w:b/>
           <w:bCs/>
-          <w:lang w:val="en-US"/>
-        </w:rPr>
-        <w:t xml:space="preserve">"PDF </w:t>
-      </w:r>
-      <w:proofErr w:type="spellStart"/>
+        </w:rPr>
+        <w:t>6. </w:t>
+      </w:r>
+      <w:r>
+        <w:t>basket-</w:t>
+      </w:r>
+      <w:proofErr w:type="spellStart"/>
+      <w:r>
+        <w:t>content</w:t>
+      </w:r>
+      <w:proofErr w:type="spellEnd"/>
+      <w:r>
+        <w:t> — rozwinięta zawartość koszyka</w:t>
+      </w:r>
+      <w:r>
+        <w:br/>
+      </w:r>
+      <w:proofErr w:type="spellStart"/>
+      <w:r>
+        <w:t>Tagi</w:t>
+      </w:r>
+      <w:proofErr w:type="spellEnd"/>
+      <w:r>
+        <w:t xml:space="preserve"> z wymaganiami do przeciągania/przypisywania</w:t>
+      </w:r>
+      <w:r>
+        <w:br/>
+      </w:r>
+      <w:r>
+        <w:rPr>
+          <w:i/>
+          <w:iCs/>
+        </w:rPr>
+        <w:t xml:space="preserve">(klasa: px-4 pb-3 max-h-48 </w:t>
+      </w:r>
+      <w:proofErr w:type="spellStart"/>
+      <w:r>
+        <w:rPr>
+          <w:i/>
+          <w:iCs/>
+        </w:rPr>
+        <w:t>overflow</w:t>
+      </w:r>
+      <w:proofErr w:type="spellEnd"/>
+      <w:r>
+        <w:rPr>
+          <w:i/>
+          <w:iCs/>
+        </w:rPr>
+        <w:t>-y-auto)</w:t>
+      </w:r>
+    </w:p>
+    <w:p>
+      <w:pPr>
+        <w:spacing w:after="0"/>
+      </w:pPr>
+    </w:p>
+    <w:p>
+      <w:pPr>
+        <w:spacing w:after="0"/>
+      </w:pPr>
+      <w:r>
+        <w:t xml:space="preserve">        </w:t>
+      </w:r>
+      <w:r>
+        <w:rPr>
+          <w:rFonts w:ascii="MS Gothic" w:eastAsia="MS Gothic" w:hAnsi="MS Gothic" w:cs="MS Gothic" w:hint="eastAsia"/>
+        </w:rPr>
+        <w:t>├</w:t>
+      </w:r>
+      <w:r>
+        <w:rPr>
+          <w:rFonts w:ascii="Aptos" w:hAnsi="Aptos" w:cs="Aptos"/>
+        </w:rPr>
+        <w:t>──</w:t>
+      </w:r>
+      <w:r>
+        <w:t xml:space="preserve"> </w:t>
+      </w:r>
+      <w:proofErr w:type="spellStart"/>
+      <w:r>
+        <w:t>strategy</w:t>
+      </w:r>
+      <w:proofErr w:type="spellEnd"/>
+      <w:r>
+        <w:t xml:space="preserve"> </w:t>
+      </w:r>
+      <w:r>
+        <w:rPr>
+          <w:rFonts w:ascii="Aptos" w:hAnsi="Aptos" w:cs="Aptos"/>
+        </w:rPr>
+        <w:t>—</w:t>
+      </w:r>
+      <w:r>
+        <w:t xml:space="preserve"> Jak to chcemy zrobi</w:t>
+      </w:r>
+      <w:r>
+        <w:rPr>
+          <w:rFonts w:ascii="Aptos" w:hAnsi="Aptos" w:cs="Aptos"/>
+        </w:rPr>
+        <w:t>ć</w:t>
+      </w:r>
+    </w:p>
+    <w:p>
+      <w:pPr>
+        <w:spacing w:after="0"/>
+      </w:pPr>
+      <w:r>
+        <w:t xml:space="preserve">        │   └── edytor strategii (</w:t>
+      </w:r>
+      <w:proofErr w:type="spellStart"/>
+      <w:r>
+        <w:t>textarea</w:t>
+      </w:r>
+      <w:proofErr w:type="spellEnd"/>
+      <w:r>
+        <w:t>)</w:t>
+      </w:r>
+    </w:p>
+    <w:p>
+      <w:pPr>
+        <w:spacing w:after="0"/>
+      </w:pPr>
+      <w:r>
+        <w:t xml:space="preserve">        </w:t>
+      </w:r>
+      <w:r>
+        <w:rPr>
+          <w:rFonts w:ascii="MS Gothic" w:eastAsia="MS Gothic" w:hAnsi="MS Gothic" w:cs="MS Gothic" w:hint="eastAsia"/>
+        </w:rPr>
+        <w:t>├</w:t>
+      </w:r>
+      <w:r>
+        <w:rPr>
+          <w:rFonts w:ascii="Aptos" w:hAnsi="Aptos" w:cs="Aptos"/>
+        </w:rPr>
+        <w:t>──</w:t>
+      </w:r>
+      <w:r>
+        <w:t xml:space="preserve"> </w:t>
+      </w:r>
+      <w:proofErr w:type="spellStart"/>
+      <w:r>
+        <w:t>wbs</w:t>
+      </w:r>
+      <w:proofErr w:type="spellEnd"/>
+      <w:r>
+        <w:t xml:space="preserve"> </w:t>
+      </w:r>
+      <w:r>
+        <w:rPr>
+          <w:rFonts w:ascii="Aptos" w:hAnsi="Aptos" w:cs="Aptos"/>
+        </w:rPr>
+        <w:t>—</w:t>
+      </w:r>
+      <w:r>
+        <w:t xml:space="preserve"> Struktura zada</w:t>
+      </w:r>
+      <w:r>
+        <w:rPr>
+          <w:rFonts w:ascii="Aptos" w:hAnsi="Aptos" w:cs="Aptos"/>
+        </w:rPr>
+        <w:t>ń</w:t>
+      </w:r>
+      <w:r>
+        <w:t xml:space="preserve"> projektu: {</w:t>
+      </w:r>
+      <w:proofErr w:type="spellStart"/>
+      <w:r>
+        <w:t>projectName</w:t>
+      </w:r>
+      <w:proofErr w:type="spellEnd"/>
+      <w:r>
+        <w:t>}</w:t>
+      </w:r>
+    </w:p>
+    <w:p>
+      <w:pPr>
+        <w:spacing w:after="0"/>
+      </w:pPr>
+      <w:r>
+        <w:t xml:space="preserve">        │   └── AG </w:t>
+      </w:r>
+      <w:proofErr w:type="spellStart"/>
+      <w:r>
+        <w:t>Grid</w:t>
+      </w:r>
+      <w:proofErr w:type="spellEnd"/>
+      <w:r>
+        <w:t xml:space="preserve"> – drzewo WBS (nazwa, typ, status, osoba, znaczniki)</w:t>
+      </w:r>
+    </w:p>
+    <w:p>
+      <w:pPr>
+        <w:spacing w:after="0"/>
+        <w:rPr>
+          <w:lang w:val="en-US"/>
+        </w:rPr>
+      </w:pPr>
+      <w:r>
+        <w:lastRenderedPageBreak/>
+        <w:t xml:space="preserve">        </w:t>
+      </w:r>
+      <w:r>
+        <w:rPr>
+          <w:rFonts w:ascii="MS Gothic" w:eastAsia="MS Gothic" w:hAnsi="MS Gothic" w:cs="MS Gothic" w:hint="eastAsia"/>
+          <w:lang w:val="en-US"/>
+        </w:rPr>
+        <w:t>├</w:t>
+      </w:r>
+      <w:r>
+        <w:rPr>
+          <w:rFonts w:ascii="Aptos" w:hAnsi="Aptos" w:cs="Aptos"/>
+          <w:lang w:val="en-US"/>
+        </w:rPr>
+        <w:t>──</w:t>
+      </w:r>
+      <w:r>
+        <w:rPr>
+          <w:lang w:val="en-US"/>
+        </w:rPr>
+        <w:t xml:space="preserve"> budget </w:t>
+      </w:r>
+      <w:r>
+        <w:rPr>
+          <w:rFonts w:ascii="Aptos" w:hAnsi="Aptos" w:cs="Aptos"/>
+          <w:lang w:val="en-US"/>
+        </w:rPr>
+        <w:t>—</w:t>
+      </w:r>
+      <w:r>
+        <w:rPr>
+          <w:lang w:val="en-US"/>
+        </w:rPr>
+        <w:t xml:space="preserve"> Plan </w:t>
+      </w:r>
+      <w:proofErr w:type="spellStart"/>
+      <w:r>
+        <w:rPr>
+          <w:lang w:val="en-US"/>
+        </w:rPr>
+        <w:t>i</w:t>
+      </w:r>
+      <w:proofErr w:type="spellEnd"/>
+      <w:r>
+        <w:rPr>
+          <w:lang w:val="en-US"/>
+        </w:rPr>
+        <w:t xml:space="preserve"> </w:t>
+      </w:r>
+      <w:proofErr w:type="spellStart"/>
+      <w:r>
+        <w:rPr>
+          <w:lang w:val="en-US"/>
+        </w:rPr>
+        <w:t>harmonogram</w:t>
+      </w:r>
+      <w:proofErr w:type="spellEnd"/>
+      <w:r>
+        <w:rPr>
+          <w:lang w:val="en-US"/>
+        </w:rPr>
+        <w:t xml:space="preserve"> (</w:t>
+      </w:r>
+      <w:proofErr w:type="spellStart"/>
+      <w:r>
+        <w:rPr>
+          <w:lang w:val="en-US"/>
+        </w:rPr>
+        <w:t>Bud</w:t>
+      </w:r>
+      <w:r>
+        <w:rPr>
+          <w:rFonts w:ascii="Aptos" w:hAnsi="Aptos" w:cs="Aptos"/>
+          <w:lang w:val="en-US"/>
+        </w:rPr>
+        <w:t>ż</w:t>
+      </w:r>
+      <w:r>
+        <w:rPr>
+          <w:lang w:val="en-US"/>
+        </w:rPr>
+        <w:t>et</w:t>
+      </w:r>
+      <w:proofErr w:type="spellEnd"/>
+      <w:r>
+        <w:rPr>
+          <w:lang w:val="en-US"/>
+        </w:rPr>
+        <w:t>) (manager/admin)</w:t>
+      </w:r>
+    </w:p>
+    <w:p>
+      <w:pPr>
+        <w:spacing w:after="0"/>
+      </w:pPr>
+      <w:r>
+        <w:rPr>
+          <w:lang w:val="en-US"/>
+        </w:rPr>
+        <w:t xml:space="preserve">        </w:t>
+      </w:r>
+      <w:r>
+        <w:t xml:space="preserve">│   └── AG </w:t>
+      </w:r>
+      <w:proofErr w:type="spellStart"/>
+      <w:r>
+        <w:t>Grid</w:t>
+      </w:r>
+      <w:proofErr w:type="spellEnd"/>
+      <w:r>
+        <w:t xml:space="preserve"> – tabela budżetowa (koszt, ilość, marża, rabat, cena)</w:t>
+      </w:r>
+    </w:p>
+    <w:p>
+      <w:pPr>
+        <w:spacing w:after="0"/>
+        <w:rPr>
+          <w:lang w:val="en-US"/>
+        </w:rPr>
+      </w:pPr>
+      <w:r>
+        <w:t xml:space="preserve">        </w:t>
+      </w:r>
+      <w:r>
+        <w:rPr>
+          <w:lang w:val="en-US"/>
+        </w:rPr>
+        <w:t xml:space="preserve">└── materials2 — </w:t>
+      </w:r>
+      <w:proofErr w:type="spellStart"/>
+      <w:r>
+        <w:rPr>
+          <w:lang w:val="en-US"/>
+        </w:rPr>
+        <w:t>Materiały</w:t>
+      </w:r>
+      <w:proofErr w:type="spellEnd"/>
+    </w:p>
+    <w:p>
+      <w:pPr>
+        <w:spacing w:after="0"/>
+        <w:rPr>
+          <w:lang w:val="en-US"/>
+        </w:rPr>
+      </w:pPr>
+      <w:r>
+        <w:rPr>
+          <w:lang w:val="en-US"/>
+        </w:rPr>
+        <w:t xml:space="preserve">            └── &lt;MaterialRequirementsPanel3&gt;</w:t>
+      </w:r>
+    </w:p>
+    <w:p>
+      <w:pPr>
+        <w:spacing w:after="0"/>
+        <w:rPr>
+          <w:lang w:val="en-US"/>
+        </w:rPr>
+      </w:pPr>
+    </w:p>
+    <w:p>
+      <w:pPr>
+        <w:spacing w:after="0"/>
+        <w:rPr>
+          <w:lang w:val="en-US"/>
+        </w:rPr>
+      </w:pPr>
+    </w:p>
+    <w:p>
+      <w:pPr>
+        <w:spacing w:after="0"/>
+        <w:rPr>
+          <w:lang w:val="en-US"/>
+        </w:rPr>
+      </w:pPr>
+      <w:r>
+        <w:rPr>
+          <w:lang w:val="en-US"/>
+        </w:rPr>
+        <w:t>Root (</w:t>
+      </w:r>
+      <w:proofErr w:type="spellStart"/>
+      <w:proofErr w:type="gramStart"/>
+      <w:r>
+        <w:rPr>
+          <w:lang w:val="en-US"/>
+        </w:rPr>
+        <w:t>nodeName</w:t>
+      </w:r>
+      <w:proofErr w:type="spellEnd"/>
+      <w:r>
+        <w:rPr>
+          <w:lang w:val="en-US"/>
+        </w:rPr>
+        <w:t xml:space="preserve">)   </w:t>
+      </w:r>
+      <w:proofErr w:type="gramEnd"/>
+      <w:r>
+        <w:rPr>
+          <w:lang w:val="en-US"/>
+        </w:rPr>
+        <w:t xml:space="preserve">                 — depth -1, slate, </w:t>
+      </w:r>
+      <w:proofErr w:type="spellStart"/>
+      <w:r>
+        <w:rPr>
+          <w:lang w:val="en-US"/>
+        </w:rPr>
+        <w:t>brak</w:t>
+      </w:r>
+      <w:proofErr w:type="spellEnd"/>
+      <w:r>
+        <w:rPr>
+          <w:lang w:val="en-US"/>
+        </w:rPr>
+        <w:t xml:space="preserve"> </w:t>
+      </w:r>
+      <w:proofErr w:type="spellStart"/>
+      <w:r>
+        <w:rPr>
+          <w:lang w:val="en-US"/>
+        </w:rPr>
+        <w:t>typu</w:t>
+      </w:r>
+      <w:proofErr w:type="spellEnd"/>
+    </w:p>
+    <w:p>
+      <w:pPr>
+        <w:spacing w:after="0"/>
+      </w:pPr>
+      <w:r>
+        <w:rPr>
+          <w:lang w:val="en-US"/>
+        </w:rPr>
+        <w:t xml:space="preserve">  </w:t>
+      </w:r>
+      <w:r>
+        <w:t xml:space="preserve">└─ Przedmiot projektu            — </w:t>
+      </w:r>
+      <w:proofErr w:type="spellStart"/>
+      <w:r>
+        <w:t>depth</w:t>
+      </w:r>
+      <w:proofErr w:type="spellEnd"/>
+      <w:r>
+        <w:t xml:space="preserve"> 0, niebieski, </w:t>
+      </w:r>
+      <w:proofErr w:type="spellStart"/>
+      <w:r>
+        <w:t>bold</w:t>
+      </w:r>
+      <w:proofErr w:type="spellEnd"/>
+      <w:r>
+        <w:t xml:space="preserve"> </w:t>
+      </w:r>
+      <w:proofErr w:type="spellStart"/>
+      <w:r>
+        <w:t>uppercase</w:t>
+      </w:r>
+      <w:proofErr w:type="spellEnd"/>
+      <w:r>
+        <w:t xml:space="preserve">, BEZ </w:t>
+      </w:r>
+      <w:proofErr w:type="spellStart"/>
+      <w:r>
+        <w:t>selecta</w:t>
+      </w:r>
+      <w:proofErr w:type="spellEnd"/>
+      <w:r>
+        <w:t xml:space="preserve"> typu</w:t>
+      </w:r>
+    </w:p>
+    <w:p>
+      <w:pPr>
+        <w:spacing w:after="0"/>
+      </w:pPr>
+      <w:r>
+        <w:t xml:space="preserve">       └─ Element podrzędny        — </w:t>
+      </w:r>
+      <w:proofErr w:type="spellStart"/>
+      <w:r>
+        <w:t>depth</w:t>
+      </w:r>
+      <w:proofErr w:type="spellEnd"/>
+      <w:r>
+        <w:t xml:space="preserve"> 1, fioletowy, </w:t>
+      </w:r>
+      <w:proofErr w:type="spellStart"/>
+      <w:r>
+        <w:t>select</w:t>
+      </w:r>
+      <w:proofErr w:type="spellEnd"/>
+      <w:r>
+        <w:t>: Urządzenie/Materiał/Praca/Usługi</w:t>
+      </w:r>
+    </w:p>
+    <w:p>
+      <w:pPr>
+        <w:spacing w:after="0"/>
+        <w:rPr>
+          <w:lang w:val="en-US"/>
+        </w:rPr>
+      </w:pPr>
+      <w:r>
+        <w:t xml:space="preserve">            </w:t>
+      </w:r>
+      <w:r>
+        <w:rPr>
+          <w:lang w:val="en-US"/>
+        </w:rPr>
+        <w:t xml:space="preserve">└─ Pod-element          — depth 2, teal, select </w:t>
+      </w:r>
+      <w:proofErr w:type="spellStart"/>
+      <w:r>
+        <w:rPr>
+          <w:lang w:val="en-US"/>
+        </w:rPr>
+        <w:t>typu</w:t>
+      </w:r>
+      <w:proofErr w:type="spellEnd"/>
+    </w:p>
+    <w:p>
+      <w:pPr>
+        <w:spacing w:after="0"/>
+        <w:rPr>
+          <w:lang w:val="en-US"/>
+        </w:rPr>
+      </w:pPr>
+      <w:r>
+        <w:rPr>
+          <w:lang w:val="en-US"/>
+        </w:rPr>
+        <w:t xml:space="preserve">                 └─ </w:t>
+      </w:r>
+      <w:proofErr w:type="spellStart"/>
+      <w:r>
+        <w:rPr>
+          <w:lang w:val="en-US"/>
+        </w:rPr>
+        <w:t>Najgłębszy</w:t>
+      </w:r>
+      <w:proofErr w:type="spellEnd"/>
+      <w:r>
+        <w:rPr>
+          <w:lang w:val="en-US"/>
+        </w:rPr>
+        <w:t xml:space="preserve">      — depth 3 (MAX), amber, select </w:t>
+      </w:r>
+      <w:proofErr w:type="spellStart"/>
+      <w:r>
+        <w:rPr>
+          <w:lang w:val="en-US"/>
+        </w:rPr>
+        <w:t>typu</w:t>
+      </w:r>
+      <w:proofErr w:type="spellEnd"/>
+    </w:p>
+    <w:p>
+      <w:pPr>
+        <w:spacing w:after="0"/>
+        <w:rPr>
+          <w:lang w:val="en-US"/>
+        </w:rPr>
+      </w:pPr>
+    </w:p>
+    <w:p>
+      <w:pPr>
+        <w:spacing w:after="0"/>
+        <w:rPr>
+          <w:lang w:val="en-US"/>
+        </w:rPr>
+      </w:pPr>
+    </w:p>
+    <w:p>
+      <w:pPr>
+        <w:spacing w:after="0"/>
+        <w:rPr>
+          <w:lang w:val="en-US"/>
+        </w:rPr>
+      </w:pPr>
+    </w:p>
+    <w:p>
+      <w:pPr>
+        <w:spacing w:after="0"/>
+        <w:rPr>
+          <w:lang w:val="en-US"/>
+        </w:rPr>
+      </w:pPr>
+    </w:p>
+    <w:p>
+      <w:pPr>
+        <w:spacing w:after="0"/>
+        <w:rPr>
+          <w:lang w:val="en-US"/>
+        </w:rPr>
+      </w:pPr>
+    </w:p>
+    <w:p>
+      <w:pPr>
+        <w:spacing w:after="0"/>
+        <w:rPr>
+          <w:lang w:val="en-US"/>
+        </w:rPr>
+      </w:pPr>
+    </w:p>
+    <w:p>
+      <w:pPr>
+        <w:spacing w:after="0"/>
+        <w:rPr>
+          <w:lang w:val="en-US"/>
+        </w:rPr>
+      </w:pPr>
       <w:r>
         <w:rPr>
           <w:b/>
           <w:bCs/>
           <w:lang w:val="en-US"/>
         </w:rPr>
-        <w:t>tej</w:t>
-      </w:r>
-      <w:proofErr w:type="spellEnd"/>
+        <w:t xml:space="preserve">"PDF </w:t>
+      </w:r>
+      <w:proofErr w:type="spellStart"/>
       <w:r>
         <w:rPr>
           <w:b/>
           <w:bCs/>
           <w:lang w:val="en-US"/>
         </w:rPr>
-        <w:t xml:space="preserve"> </w:t>
-      </w:r>
-      <w:proofErr w:type="spellStart"/>
+        <w:t>wszystkie</w:t>
+      </w:r>
+      <w:proofErr w:type="spellEnd"/>
       <w:r>
         <w:rPr>
           <w:b/>
           <w:bCs/>
           <w:lang w:val="en-US"/>
         </w:rPr>
-        <w:t>zakładki</w:t>
-      </w:r>
-      <w:proofErr w:type="spellEnd"/>
+        <w:t xml:space="preserve"> </w:t>
+      </w:r>
+      <w:proofErr w:type="spellStart"/>
       <w:r>
         <w:rPr>
           <w:b/>
           <w:bCs/>
           <w:lang w:val="en-US"/>
         </w:rPr>
+        <w:t>sekcje</w:t>
+      </w:r>
+      <w:proofErr w:type="spellEnd"/>
+      <w:r>
+        <w:rPr>
+          <w:b/>
+          <w:bCs/>
+          <w:lang w:val="en-US"/>
+        </w:rPr>
         <w:t>"</w:t>
       </w:r>
       <w:r>
         <w:rPr>
           <w:lang w:val="en-US"/>
         </w:rPr>
+        <w:t> — projectPdfExport.js</w:t>
+      </w:r>
+    </w:p>
+    <w:p>
+      <w:pPr>
+        <w:spacing w:after="0"/>
+        <w:rPr>
+          <w:lang w:val="en-US"/>
+        </w:rPr>
+      </w:pPr>
+      <w:r>
+        <w:rPr>
+          <w:b/>
+          <w:bCs/>
+          <w:lang w:val="en-US"/>
+        </w:rPr>
+        <w:t xml:space="preserve">"PDF </w:t>
+      </w:r>
+      <w:proofErr w:type="spellStart"/>
+      <w:r>
+        <w:rPr>
+          <w:b/>
+          <w:bCs/>
+          <w:lang w:val="en-US"/>
+        </w:rPr>
+        <w:t>tej</w:t>
+      </w:r>
+      <w:proofErr w:type="spellEnd"/>
+      <w:r>
+        <w:rPr>
+          <w:b/>
+          <w:bCs/>
+          <w:lang w:val="en-US"/>
+        </w:rPr>
+        <w:t xml:space="preserve"> </w:t>
+      </w:r>
+      <w:proofErr w:type="spellStart"/>
+      <w:r>
+        <w:rPr>
+          <w:b/>
+          <w:bCs/>
+          <w:lang w:val="en-US"/>
+        </w:rPr>
+        <w:t>zakładki</w:t>
+      </w:r>
+      <w:proofErr w:type="spellEnd"/>
+      <w:r>
+        <w:rPr>
+          <w:b/>
+          <w:bCs/>
+          <w:lang w:val="en-US"/>
+        </w:rPr>
+        <w:t>"</w:t>
+      </w:r>
+      <w:r>
+        <w:rPr>
+          <w:lang w:val="en-US"/>
+        </w:rPr>
         <w:t xml:space="preserve"> — </w:t>
       </w:r>
       <w:proofErr w:type="spellStart"/>
@@ -1579,243 +2086,271 @@
         <w:rPr>
           <w:lang w:val="en-US"/>
         </w:rPr>
+        <w:t># 1. Commit</w:t>
+      </w:r>
+    </w:p>
+    <w:p>
+      <w:pPr>
+        <w:spacing w:after="0"/>
+        <w:rPr>
+          <w:lang w:val="en-US"/>
+        </w:rPr>
+      </w:pPr>
+      <w:r>
+        <w:rPr>
+          <w:lang w:val="en-US"/>
+        </w:rPr>
+        <w:t>cd C:/Users/Andrzej/.gemini/antigravity/scratch/Ignite</w:t>
+      </w:r>
+    </w:p>
+    <w:p>
+      <w:pPr>
+        <w:spacing w:after="0"/>
+        <w:rPr>
+          <w:lang w:val="en-US"/>
+        </w:rPr>
+      </w:pPr>
+      <w:r>
+        <w:rPr>
+          <w:lang w:val="en-US"/>
+        </w:rPr>
+        <w:t>git add apps/frontend/</w:t>
+      </w:r>
+      <w:proofErr w:type="spellStart"/>
+      <w:r>
+        <w:rPr>
+          <w:lang w:val="en-US"/>
+        </w:rPr>
+        <w:t>src</w:t>
+      </w:r>
+      <w:proofErr w:type="spellEnd"/>
+      <w:r>
+        <w:rPr>
+          <w:lang w:val="en-US"/>
+        </w:rPr>
+        <w:t>/components/shared/</w:t>
+      </w:r>
+      <w:proofErr w:type="spellStart"/>
+      <w:r>
+        <w:rPr>
+          <w:lang w:val="en-US"/>
+        </w:rPr>
+        <w:t>wbs</w:t>
+      </w:r>
+      <w:proofErr w:type="spellEnd"/>
+      <w:r>
+        <w:rPr>
+          <w:lang w:val="en-US"/>
+        </w:rPr>
+        <w:t>/</w:t>
+      </w:r>
+      <w:proofErr w:type="spellStart"/>
+      <w:r>
+        <w:rPr>
+          <w:lang w:val="en-US"/>
+        </w:rPr>
+        <w:t>UnifiedWbsPanel.jsx</w:t>
+      </w:r>
+      <w:proofErr w:type="spellEnd"/>
+    </w:p>
+    <w:p>
+      <w:pPr>
+        <w:spacing w:after="0"/>
+        <w:rPr>
+          <w:lang w:val="en-US"/>
+        </w:rPr>
+      </w:pPr>
+      <w:r>
+        <w:rPr>
+          <w:lang w:val="en-US"/>
+        </w:rPr>
+        <w:t xml:space="preserve">git commit -m "fix: remove immediate refresh callbacks to prevent race </w:t>
+      </w:r>
+      <w:proofErr w:type="gramStart"/>
+      <w:r>
+        <w:rPr>
+          <w:lang w:val="en-US"/>
+        </w:rPr>
+        <w:t>condition</w:t>
+      </w:r>
+      <w:proofErr w:type="gramEnd"/>
+      <w:r>
+        <w:rPr>
+          <w:lang w:val="en-US"/>
+        </w:rPr>
+        <w:t xml:space="preserve"> in </w:t>
+      </w:r>
+      <w:proofErr w:type="spellStart"/>
+      <w:r>
+        <w:rPr>
+          <w:lang w:val="en-US"/>
+        </w:rPr>
+        <w:t>HybridWBS</w:t>
+      </w:r>
+      <w:proofErr w:type="spellEnd"/>
+      <w:r>
+        <w:rPr>
+          <w:lang w:val="en-US"/>
+        </w:rPr>
+        <w:t>"</w:t>
+      </w:r>
+    </w:p>
+    <w:p>
+      <w:pPr>
+        <w:spacing w:after="0"/>
+        <w:rPr>
+          <w:lang w:val="en-US"/>
+        </w:rPr>
+      </w:pPr>
+    </w:p>
+    <w:p>
+      <w:pPr>
+        <w:spacing w:after="0"/>
+        <w:rPr>
+          <w:lang w:val="en-US"/>
+        </w:rPr>
+      </w:pPr>
+      <w:r>
+        <w:rPr>
+          <w:lang w:val="en-US"/>
+        </w:rPr>
+        <w:t># 2. Build frontend</w:t>
+      </w:r>
+    </w:p>
+    <w:p>
+      <w:pPr>
+        <w:spacing w:after="0"/>
+        <w:rPr>
+          <w:lang w:val="en-US"/>
+        </w:rPr>
+      </w:pPr>
+      <w:r>
+        <w:rPr>
+          <w:lang w:val="en-US"/>
+        </w:rPr>
+        <w:t xml:space="preserve">cd apps/frontend &amp;&amp; </w:t>
+      </w:r>
+      <w:proofErr w:type="spellStart"/>
+      <w:r>
+        <w:rPr>
+          <w:lang w:val="en-US"/>
+        </w:rPr>
+        <w:t>npx</w:t>
+      </w:r>
+      <w:proofErr w:type="spellEnd"/>
+      <w:r>
+        <w:rPr>
+          <w:lang w:val="en-US"/>
+        </w:rPr>
+        <w:t xml:space="preserve"> </w:t>
+      </w:r>
+      <w:proofErr w:type="spellStart"/>
+      <w:r>
+        <w:rPr>
+          <w:lang w:val="en-US"/>
+        </w:rPr>
+        <w:t>vite</w:t>
+      </w:r>
+      <w:proofErr w:type="spellEnd"/>
+      <w:r>
+        <w:rPr>
+          <w:lang w:val="en-US"/>
+        </w:rPr>
+        <w:t xml:space="preserve"> build</w:t>
+      </w:r>
+    </w:p>
+    <w:p>
+      <w:pPr>
+        <w:spacing w:after="0"/>
+        <w:rPr>
+          <w:lang w:val="en-US"/>
+        </w:rPr>
+      </w:pPr>
+    </w:p>
+    <w:p>
+      <w:pPr>
+        <w:spacing w:after="0"/>
+        <w:rPr>
+          <w:lang w:val="en-US"/>
+        </w:rPr>
+      </w:pPr>
+      <w:r>
+        <w:rPr>
+          <w:lang w:val="en-US"/>
+        </w:rPr>
+        <w:t xml:space="preserve"># 3. Rebuild </w:t>
+      </w:r>
+      <w:proofErr w:type="spellStart"/>
+      <w:r>
+        <w:rPr>
+          <w:lang w:val="en-US"/>
+        </w:rPr>
+        <w:t>i</w:t>
+      </w:r>
+      <w:proofErr w:type="spellEnd"/>
+      <w:r>
+        <w:rPr>
+          <w:lang w:val="en-US"/>
+        </w:rPr>
+        <w:t xml:space="preserve"> restart </w:t>
+      </w:r>
+      <w:proofErr w:type="spellStart"/>
+      <w:r>
+        <w:rPr>
+          <w:lang w:val="en-US"/>
+        </w:rPr>
+        <w:t>kontenerów</w:t>
+      </w:r>
+      <w:proofErr w:type="spellEnd"/>
+    </w:p>
+    <w:p>
+      <w:pPr>
+        <w:spacing w:after="0"/>
+        <w:rPr>
+          <w:lang w:val="en-US"/>
+        </w:rPr>
+      </w:pPr>
+      <w:r>
+        <w:rPr>
+          <w:lang w:val="en-US"/>
+        </w:rPr>
+        <w:t>cd</w:t>
+      </w:r>
+      <w:proofErr w:type="gramStart"/>
+      <w:r>
+        <w:rPr>
+          <w:lang w:val="en-US"/>
+        </w:rPr>
+        <w:t xml:space="preserve"> ../..</w:t>
+      </w:r>
+      <w:proofErr w:type="gramEnd"/>
+      <w:r>
+        <w:rPr>
+          <w:lang w:val="en-US"/>
+        </w:rPr>
+        <w:t xml:space="preserve"> &amp;&amp; cd apps &amp;&amp; docker compose up -d --build frontend</w:t>
+      </w:r>
+    </w:p>
+    <w:p>
+      <w:pPr>
+        <w:spacing w:after="0"/>
+        <w:rPr>
+          <w:lang w:val="en-US"/>
+        </w:rPr>
+      </w:pPr>
+    </w:p>
+    <w:p>
+      <w:pPr>
+        <w:spacing w:after="0"/>
+        <w:rPr>
+          <w:lang w:val="en-US"/>
+        </w:rPr>
+      </w:pPr>
+      <w:r>
+        <w:rPr>
+          <w:lang w:val="en-US"/>
+        </w:rPr>
         <w:lastRenderedPageBreak/>
-        <w:t># 1. Commit</w:t>
-      </w:r>
-    </w:p>
-    <w:p>
-      <w:pPr>
-        <w:spacing w:after="0"/>
-        <w:rPr>
-          <w:lang w:val="en-US"/>
-        </w:rPr>
-      </w:pPr>
-      <w:r>
-        <w:rPr>
-          <w:lang w:val="en-US"/>
-        </w:rPr>
-        <w:t>cd C:/Users/Andrzej/.gemini/antigravity/scratch/Ignite</w:t>
-      </w:r>
-    </w:p>
-    <w:p>
-      <w:pPr>
-        <w:spacing w:after="0"/>
-        <w:rPr>
-          <w:lang w:val="en-US"/>
-        </w:rPr>
-      </w:pPr>
-      <w:r>
-        <w:rPr>
-          <w:lang w:val="en-US"/>
-        </w:rPr>
-        <w:t>git add apps/frontend/</w:t>
-      </w:r>
-      <w:proofErr w:type="spellStart"/>
-      <w:r>
-        <w:rPr>
-          <w:lang w:val="en-US"/>
-        </w:rPr>
-        <w:t>src</w:t>
-      </w:r>
-      <w:proofErr w:type="spellEnd"/>
-      <w:r>
-        <w:rPr>
-          <w:lang w:val="en-US"/>
-        </w:rPr>
-        <w:t>/components/shared/</w:t>
-      </w:r>
-      <w:proofErr w:type="spellStart"/>
-      <w:r>
-        <w:rPr>
-          <w:lang w:val="en-US"/>
-        </w:rPr>
-        <w:t>wbs</w:t>
-      </w:r>
-      <w:proofErr w:type="spellEnd"/>
-      <w:r>
-        <w:rPr>
-          <w:lang w:val="en-US"/>
-        </w:rPr>
-        <w:t>/</w:t>
-      </w:r>
-      <w:proofErr w:type="spellStart"/>
-      <w:r>
-        <w:rPr>
-          <w:lang w:val="en-US"/>
-        </w:rPr>
-        <w:t>UnifiedWbsPanel.jsx</w:t>
-      </w:r>
-      <w:proofErr w:type="spellEnd"/>
-    </w:p>
-    <w:p>
-      <w:pPr>
-        <w:spacing w:after="0"/>
-        <w:rPr>
-          <w:lang w:val="en-US"/>
-        </w:rPr>
-      </w:pPr>
-      <w:r>
-        <w:rPr>
-          <w:lang w:val="en-US"/>
-        </w:rPr>
-        <w:t xml:space="preserve">git commit -m "fix: remove immediate refresh callbacks to prevent race condition in </w:t>
-      </w:r>
-      <w:proofErr w:type="spellStart"/>
-      <w:r>
-        <w:rPr>
-          <w:lang w:val="en-US"/>
-        </w:rPr>
-        <w:t>HybridWBS</w:t>
-      </w:r>
-      <w:proofErr w:type="spellEnd"/>
-      <w:r>
-        <w:rPr>
-          <w:lang w:val="en-US"/>
-        </w:rPr>
-        <w:t>"</w:t>
-      </w:r>
-    </w:p>
-    <w:p>
-      <w:pPr>
-        <w:spacing w:after="0"/>
-        <w:rPr>
-          <w:lang w:val="en-US"/>
-        </w:rPr>
-      </w:pPr>
-    </w:p>
-    <w:p>
-      <w:pPr>
-        <w:spacing w:after="0"/>
-        <w:rPr>
-          <w:lang w:val="en-US"/>
-        </w:rPr>
-      </w:pPr>
-      <w:r>
-        <w:rPr>
-          <w:lang w:val="en-US"/>
-        </w:rPr>
-        <w:t># 2. Build frontend</w:t>
-      </w:r>
-    </w:p>
-    <w:p>
-      <w:pPr>
-        <w:spacing w:after="0"/>
-        <w:rPr>
-          <w:lang w:val="en-US"/>
-        </w:rPr>
-      </w:pPr>
-      <w:r>
-        <w:rPr>
-          <w:lang w:val="en-US"/>
-        </w:rPr>
-        <w:t xml:space="preserve">cd apps/frontend &amp;&amp; </w:t>
-      </w:r>
-      <w:proofErr w:type="spellStart"/>
-      <w:r>
-        <w:rPr>
-          <w:lang w:val="en-US"/>
-        </w:rPr>
-        <w:t>npx</w:t>
-      </w:r>
-      <w:proofErr w:type="spellEnd"/>
-      <w:r>
-        <w:rPr>
-          <w:lang w:val="en-US"/>
-        </w:rPr>
-        <w:t xml:space="preserve"> </w:t>
-      </w:r>
-      <w:proofErr w:type="spellStart"/>
-      <w:r>
-        <w:rPr>
-          <w:lang w:val="en-US"/>
-        </w:rPr>
-        <w:t>vite</w:t>
-      </w:r>
-      <w:proofErr w:type="spellEnd"/>
-      <w:r>
-        <w:rPr>
-          <w:lang w:val="en-US"/>
-        </w:rPr>
-        <w:t xml:space="preserve"> build</w:t>
-      </w:r>
-    </w:p>
-    <w:p>
-      <w:pPr>
-        <w:spacing w:after="0"/>
-        <w:rPr>
-          <w:lang w:val="en-US"/>
-        </w:rPr>
-      </w:pPr>
-    </w:p>
-    <w:p>
-      <w:pPr>
-        <w:spacing w:after="0"/>
-        <w:rPr>
-          <w:lang w:val="en-US"/>
-        </w:rPr>
-      </w:pPr>
-      <w:r>
-        <w:rPr>
-          <w:lang w:val="en-US"/>
-        </w:rPr>
-        <w:t xml:space="preserve"># 3. Rebuild </w:t>
-      </w:r>
-      <w:proofErr w:type="spellStart"/>
-      <w:r>
-        <w:rPr>
-          <w:lang w:val="en-US"/>
-        </w:rPr>
-        <w:t>i</w:t>
-      </w:r>
-      <w:proofErr w:type="spellEnd"/>
-      <w:r>
-        <w:rPr>
-          <w:lang w:val="en-US"/>
-        </w:rPr>
-        <w:t xml:space="preserve"> restart </w:t>
-      </w:r>
-      <w:proofErr w:type="spellStart"/>
-      <w:r>
-        <w:rPr>
-          <w:lang w:val="en-US"/>
-        </w:rPr>
-        <w:t>kontenerów</w:t>
-      </w:r>
-      <w:proofErr w:type="spellEnd"/>
-    </w:p>
-    <w:p>
-      <w:pPr>
-        <w:spacing w:after="0"/>
-        <w:rPr>
-          <w:lang w:val="en-US"/>
-        </w:rPr>
-      </w:pPr>
-      <w:r>
-        <w:rPr>
-          <w:lang w:val="en-US"/>
-        </w:rPr>
-        <w:t>cd ../.. &amp;&amp; cd apps &amp;&amp; docker compose up -d --build frontend</w:t>
-      </w:r>
-    </w:p>
-    <w:p>
-      <w:pPr>
-        <w:spacing w:after="0"/>
-        <w:rPr>
-          <w:lang w:val="en-US"/>
-        </w:rPr>
-      </w:pPr>
-    </w:p>
-    <w:p>
-      <w:pPr>
-        <w:spacing w:after="0"/>
-        <w:rPr>
-          <w:lang w:val="en-US"/>
-        </w:rPr>
-      </w:pPr>
-      <w:r>
-        <w:rPr>
-          <w:lang w:val="en-US"/>
-        </w:rPr>
         <w:t>DEPLOY</w:t>
       </w:r>
     </w:p>
@@ -2803,7 +3338,6 @@
   <w:style w:type="character" w:default="1" w:styleId="Domylnaczcionkaakapitu">
     <w:name w:val="Default Paragraph Font"/>
     <w:uiPriority w:val="1"/>
-    <w:semiHidden/>
     <w:unhideWhenUsed/>
   </w:style>
   <w:style w:type="table" w:default="1" w:styleId="Standardowy">

</xml_diff>